<commit_message>
feat: implement manual semester archiving and license expiration handling
- Added ArsipSemesterController for manual creation, download, and deletion of semester archives.
- Introduced LisensiTerkunciController to manage license expiration in server mode.
- Created BuatArsipSemesterJob for background processing of archive creation.
- Developed PembuatArsip to generate PDF reports for semester archives.
- Added migration for arsip_semesters table to store archive metadata.
- Updated routes to include new functionalities for archiving and license management.
- Created views for license expiration notification.
</commit_message>
<xml_diff>
--- a/docs/Panduan-Database-Admin.docx
+++ b/docs/Panduan-Database-Admin.docx
@@ -71,7 +71,7 @@
           <w:color w:val="595959"/>
           <w:sz w:val="22"/>
         </w:rPr>
-        <w:t xml:space="preserve">Edisi Agustus 2026</w:t>
+        <w:t xml:space="preserve">Edisi September 2026</w:t>
       </w:r>
     </w:p>
     <w:p>
@@ -1113,7 +1113,7 @@
               <w:rPr>
                 <w:sz w:val="19"/>
               </w:rPr>
-              <w:t xml:space="preserve">Berkas RAHASIA: foto bukti pelanggaran &amp; pembinaan BK, lampiran surat</w:t>
+              <w:t xml:space="preserve">Berkas RAHASIA: foto bukti pelanggaran &amp; pembinaan BK, lampiran surat, sertifikat prestasi siswa</w:t>
             </w:r>
           </w:p>
         </w:tc>
@@ -1129,7 +1129,7 @@
               <w:rPr>
                 <w:sz w:val="19"/>
               </w:rPr>
-              <w:t xml:space="preserve">Catatan BK masih ada, tapi foto buktinya hilang semua</w:t>
+              <w:t xml:space="preserve">Catatan BK masih ada tapi foto buktinya hilang, dan prestasi kehilangan sertifikatnya</w:t>
             </w:r>
           </w:p>
         </w:tc>
@@ -1288,7 +1288,7 @@
         <w:jc w:val="both"/>
       </w:pPr>
       <w:r>
-        <w:t xml:space="preserve">Database ini berisi 55 tabel. Untuk keperluan pengelolaan, semuanya masuk salah satu dari tiga golongan berikut. Pembagian inilah yang dipakai perintah pengosongan data di Bagian D.</w:t>
+        <w:t xml:space="preserve">Database ini berisi 57 tabel. Untuk keperluan pengelolaan, semuanya masuk salah satu dari tiga golongan berikut. Pembagian inilah yang dipakai perintah pengosongan data di Bagian D.</w:t>
       </w:r>
     </w:p>
     <w:p>
@@ -1296,7 +1296,7 @@
         <w:pStyle w:val="Heading3"/>
       </w:pPr>
       <w:r>
-        <w:t xml:space="preserve">Golongan 1 — Master data (14 tabel)</w:t>
+        <w:t xml:space="preserve">Golongan 1 — Master data (15 tabel)</w:t>
       </w:r>
     </w:p>
     <w:p>
@@ -1891,7 +1891,43 @@
               <w:rPr>
                 <w:sz w:val="19"/>
               </w:rPr>
-              <w:t xml:space="preserve">Bukti aktivasi nomor seri — milik sistem, jangan disentuh</w:t>
+              <w:t xml:space="preserve">Bukti aktivasi lisensi — milik sistem, jangan disentuh</w:t>
+            </w:r>
+          </w:p>
+        </w:tc>
+      </w:tr>
+      <w:tr>
+        <w:tc>
+          <w:tcPr>
+            <w:tcW w:w="1500" w:type="pct"/>
+          </w:tcPr>
+          <w:p>
+            <w:pPr>
+              <w:spacing w:after="0"/>
+            </w:pPr>
+            <w:r>
+              <w:rPr>
+                <w:rFonts w:ascii="Consolas" w:hAnsi="Consolas"/>
+                <w:color w:val="B03060"/>
+                <w:sz w:val="19"/>
+              </w:rPr>
+              <w:t xml:space="preserve">pengaturan_aplikasis</w:t>
+            </w:r>
+          </w:p>
+        </w:tc>
+        <w:tc>
+          <w:tcPr>
+            <w:tcW w:w="3500" w:type="pct"/>
+          </w:tcPr>
+          <w:p>
+            <w:pPr>
+              <w:spacing w:after="0"/>
+            </w:pPr>
+            <w:r>
+              <w:rPr>
+                <w:sz w:val="19"/>
+              </w:rPr>
+              <w:t xml:space="preserve">Pengenal pemasangan &amp; surat lisensi dari server — milik sistem, jangan disentuh</w:t>
             </w:r>
           </w:p>
         </w:tc>
@@ -1907,7 +1943,7 @@
         <w:pStyle w:val="Heading3"/>
       </w:pPr>
       <w:r>
-        <w:t xml:space="preserve">Golongan 2 — Data sekolah (35 tabel)</w:t>
+        <w:t xml:space="preserve">Golongan 2 — Data sekolah (36 tabel)</w:t>
       </w:r>
     </w:p>
     <w:p>
@@ -2625,6 +2661,57 @@
               <w:rPr>
                 <w:sz w:val="19"/>
               </w:rPr>
+              <w:t xml:space="preserve">Prestasi siswa</w:t>
+            </w:r>
+          </w:p>
+        </w:tc>
+        <w:tc>
+          <w:tcPr>
+            <w:tcW w:w="3600" w:type="pct"/>
+          </w:tcPr>
+          <w:p>
+            <w:pPr>
+              <w:spacing w:after="0"/>
+            </w:pPr>
+            <w:r>
+              <w:rPr>
+                <w:rFonts w:ascii="Consolas" w:hAnsi="Consolas"/>
+                <w:color w:val="B03060"/>
+                <w:sz w:val="19"/>
+              </w:rPr>
+              <w:t xml:space="preserve">prestasi_siswas</w:t>
+            </w:r>
+            <w:r>
+              <w:rPr>
+                <w:sz w:val="19"/>
+              </w:rPr>
+              <w:t xml:space="preserve"> — beserta sertifikatnya di </w:t>
+            </w:r>
+            <w:r>
+              <w:rPr>
+                <w:rFonts w:ascii="Consolas" w:hAnsi="Consolas"/>
+                <w:color w:val="B03060"/>
+                <w:sz w:val="19"/>
+              </w:rPr>
+              <w:t xml:space="preserve">storage/app/private/prestasi</w:t>
+            </w:r>
+          </w:p>
+        </w:tc>
+      </w:tr>
+      <w:tr>
+        <w:tc>
+          <w:tcPr>
+            <w:tcW w:w="1400" w:type="pct"/>
+            <w:shd w:val="clear" w:fill="F7F9FC"/>
+          </w:tcPr>
+          <w:p>
+            <w:pPr>
+              <w:spacing w:after="0"/>
+            </w:pPr>
+            <w:r>
+              <w:rPr>
+                <w:sz w:val="19"/>
+              </w:rPr>
               <w:t xml:space="preserve">Notifikasi</w:t>
             </w:r>
           </w:p>
@@ -2632,6 +2719,7 @@
         <w:tc>
           <w:tcPr>
             <w:tcW w:w="3600" w:type="pct"/>
+            <w:shd w:val="clear" w:fill="F7F9FC"/>
           </w:tcPr>
           <w:p>
             <w:pPr>
@@ -3223,7 +3311,7 @@
         <w:pStyle w:val="Heading2"/>
       </w:pPr>
       <w:r>
-        <w:t xml:space="preserve">B.2 Cara termudah — lewat phpMyAdmin</w:t>
+        <w:t xml:space="preserve">B.2 Cara yang DIANJURKAN — satu perintah</w:t>
       </w:r>
     </w:p>
     <w:p>
@@ -3232,7 +3320,762 @@
         <w:jc w:val="both"/>
       </w:pPr>
       <w:r>
-        <w:t xml:space="preserve">Cocok untuk Admin yang tidak terbiasa dengan baris perintah.</w:t>
+        <w:t xml:space="preserve">Aplikasi sudah menyediakan perintah backup sendiri. </w:t>
+      </w:r>
+      <w:r>
+        <w:rPr>
+          <w:b/>
+        </w:rPr>
+        <w:t xml:space="preserve">Inilah cara yang seharusnya dipakai</w:t>
+      </w:r>
+      <w:r>
+        <w:t xml:space="preserve">, dan dua cara berikutnya (phpMyAdmin &amp; mysqldump) hanya diperlukan bila perintah ini tidak bisa dijalankan.</w:t>
+      </w:r>
+    </w:p>
+    <w:tbl>
+      <w:tblPr>
+        <w:tblW w:w="5000" w:type="pct"/>
+        <w:tblBorders>
+          <w:top w:val="single" w:sz="4" w:color="D9D9D9"/>
+          <w:left w:val="single" w:sz="4" w:color="D9D9D9"/>
+          <w:bottom w:val="single" w:sz="4" w:color="D9D9D9"/>
+          <w:right w:val="single" w:sz="4" w:color="D9D9D9"/>
+        </w:tblBorders>
+        <w:tblCellMar>
+          <w:top w:w="120" w:type="dxa"/>
+          <w:left w:w="160" w:type="dxa"/>
+          <w:bottom w:w="120" w:type="dxa"/>
+          <w:right w:w="160" w:type="dxa"/>
+        </w:tblCellMar>
+      </w:tblPr>
+      <w:tr>
+        <w:tc>
+          <w:tcPr>
+            <w:shd w:val="clear" w:fill="F5F5F5"/>
+          </w:tcPr>
+          <w:p>
+            <w:pPr>
+              <w:spacing w:after="0" w:line="240" w:lineRule="auto"/>
+            </w:pPr>
+            <w:r>
+              <w:rPr>
+                <w:rFonts w:ascii="Consolas" w:hAnsi="Consolas"/>
+                <w:sz w:val="18"/>
+              </w:rPr>
+              <w:t xml:space="preserve">php artisan backup:buat</w:t>
+            </w:r>
+          </w:p>
+        </w:tc>
+      </w:tr>
+    </w:tbl>
+    <w:p>
+      <w:pPr>
+        <w:spacing w:after="140"/>
+      </w:pPr>
+    </w:p>
+    <w:p>
+      <w:pPr>
+        <w:spacing w:after="140" w:line="276" w:lineRule="auto"/>
+        <w:jc w:val="both"/>
+      </w:pPr>
+      <w:r>
+        <w:t xml:space="preserve">Alasannya bukan sekadar lebih singkat, melainkan lebih </w:t>
+      </w:r>
+      <w:r>
+        <w:rPr>
+          <w:b/>
+        </w:rPr>
+        <w:t xml:space="preserve">lengkap</w:t>
+      </w:r>
+      <w:r>
+        <w:t xml:space="preserve">. Mencadangkan database saja adalah kekeliruan yang paling sering terjadi dan paling terlambat disadari:</w:t>
+      </w:r>
+    </w:p>
+    <w:tbl>
+      <w:tblPr>
+        <w:tblW w:w="5000" w:type="pct"/>
+        <w:tblBorders>
+          <w:top w:val="single" w:sz="4" w:color="BFBFBF"/>
+          <w:left w:val="single" w:sz="4" w:color="BFBFBF"/>
+          <w:bottom w:val="single" w:sz="4" w:color="BFBFBF"/>
+          <w:right w:val="single" w:sz="4" w:color="BFBFBF"/>
+          <w:insideH w:val="single" w:sz="4" w:color="BFBFBF"/>
+          <w:insideV w:val="single" w:sz="4" w:color="BFBFBF"/>
+        </w:tblBorders>
+        <w:tblCellMar>
+          <w:top w:w="90" w:type="dxa"/>
+          <w:left w:w="130" w:type="dxa"/>
+          <w:bottom w:w="90" w:type="dxa"/>
+          <w:right w:w="130" w:type="dxa"/>
+        </w:tblCellMar>
+      </w:tblPr>
+      <w:tr>
+        <w:trPr>
+          <w:tblHeader/>
+        </w:trPr>
+        <w:tc>
+          <w:tcPr>
+            <w:tcW w:w="1700" w:type="pct"/>
+            <w:shd w:val="clear" w:fill="1F4E79"/>
+          </w:tcPr>
+          <w:p>
+            <w:pPr>
+              <w:spacing w:after="0"/>
+            </w:pPr>
+            <w:r>
+              <w:rPr>
+                <w:b/>
+                <w:color w:val="FFFFFF"/>
+                <w:sz w:val="19"/>
+              </w:rPr>
+              <w:t xml:space="preserve">Yang ikut tercadang</w:t>
+            </w:r>
+          </w:p>
+        </w:tc>
+        <w:tc>
+          <w:tcPr>
+            <w:tcW w:w="3300" w:type="pct"/>
+            <w:shd w:val="clear" w:fill="1F4E79"/>
+          </w:tcPr>
+          <w:p>
+            <w:pPr>
+              <w:spacing w:after="0"/>
+            </w:pPr>
+            <w:r>
+              <w:rPr>
+                <w:b/>
+                <w:color w:val="FFFFFF"/>
+                <w:sz w:val="19"/>
+              </w:rPr>
+              <w:t xml:space="preserve">Bila ini tertinggal</w:t>
+            </w:r>
+          </w:p>
+        </w:tc>
+      </w:tr>
+      <w:tr>
+        <w:tc>
+          <w:tcPr>
+            <w:tcW w:w="1700" w:type="pct"/>
+          </w:tcPr>
+          <w:p>
+            <w:pPr>
+              <w:spacing w:after="0"/>
+            </w:pPr>
+            <w:r>
+              <w:rPr>
+                <w:sz w:val="19"/>
+              </w:rPr>
+              <w:t xml:space="preserve">Seluruh database</w:t>
+            </w:r>
+          </w:p>
+        </w:tc>
+        <w:tc>
+          <w:tcPr>
+            <w:tcW w:w="3300" w:type="pct"/>
+          </w:tcPr>
+          <w:p>
+            <w:pPr>
+              <w:spacing w:after="0"/>
+            </w:pPr>
+            <w:r>
+              <w:rPr>
+                <w:sz w:val="19"/>
+              </w:rPr>
+              <w:t xml:space="preserve">—</w:t>
+            </w:r>
+          </w:p>
+        </w:tc>
+      </w:tr>
+      <w:tr>
+        <w:tc>
+          <w:tcPr>
+            <w:tcW w:w="1700" w:type="pct"/>
+            <w:shd w:val="clear" w:fill="F7F9FC"/>
+          </w:tcPr>
+          <w:p>
+            <w:pPr>
+              <w:spacing w:after="0"/>
+            </w:pPr>
+            <w:r>
+              <w:rPr>
+                <w:sz w:val="19"/>
+              </w:rPr>
+              <w:t xml:space="preserve">Folder </w:t>
+            </w:r>
+            <w:r>
+              <w:rPr>
+                <w:rFonts w:ascii="Consolas" w:hAnsi="Consolas"/>
+                <w:color w:val="B03060"/>
+                <w:sz w:val="19"/>
+              </w:rPr>
+              <w:t xml:space="preserve">storage/app</w:t>
+            </w:r>
+          </w:p>
+        </w:tc>
+        <w:tc>
+          <w:tcPr>
+            <w:tcW w:w="3300" w:type="pct"/>
+            <w:shd w:val="clear" w:fill="F7F9FC"/>
+          </w:tcPr>
+          <w:p>
+            <w:pPr>
+              <w:spacing w:after="0"/>
+            </w:pPr>
+            <w:r>
+              <w:rPr>
+                <w:sz w:val="19"/>
+              </w:rPr>
+              <w:t xml:space="preserve">Catatan BK pulih tanpa foto bukti, prestasi tanpa sertifikat, kop surat tanpa logo</w:t>
+            </w:r>
+          </w:p>
+        </w:tc>
+      </w:tr>
+      <w:tr>
+        <w:tc>
+          <w:tcPr>
+            <w:tcW w:w="1700" w:type="pct"/>
+          </w:tcPr>
+          <w:p>
+            <w:pPr>
+              <w:spacing w:after="0"/>
+            </w:pPr>
+            <w:r>
+              <w:rPr>
+                <w:b/>
+                <w:sz w:val="19"/>
+              </w:rPr>
+              <w:t xml:space="preserve">APP_KEY</w:t>
+            </w:r>
+          </w:p>
+        </w:tc>
+        <w:tc>
+          <w:tcPr>
+            <w:tcW w:w="3300" w:type="pct"/>
+          </w:tcPr>
+          <w:p>
+            <w:pPr>
+              <w:spacing w:after="0"/>
+            </w:pPr>
+            <w:r>
+              <w:rPr>
+                <w:sz w:val="19"/>
+              </w:rPr>
+              <w:t xml:space="preserve">Token WhatsApp dan aktivasi lisensi di dalam database menjadi </w:t>
+            </w:r>
+            <w:r>
+              <w:rPr>
+                <w:b/>
+                <w:sz w:val="19"/>
+              </w:rPr>
+              <w:t xml:space="preserve">sampah permanen</w:t>
+            </w:r>
+            <w:r>
+              <w:rPr>
+                <w:sz w:val="19"/>
+              </w:rPr>
+              <w:t xml:space="preserve"> — tidak bisa dipulihkan siapa pun, termasuk Anda</w:t>
+            </w:r>
+          </w:p>
+        </w:tc>
+      </w:tr>
+    </w:tbl>
+    <w:p>
+      <w:pPr>
+        <w:spacing w:after="140"/>
+      </w:pPr>
+    </w:p>
+    <w:tbl>
+      <w:tblPr>
+        <w:tblW w:w="5000" w:type="pct"/>
+        <w:tblBorders>
+          <w:top w:val="single" w:sz="4" w:color="E0C878"/>
+          <w:left w:val="single" w:sz="18" w:color="E0A800"/>
+          <w:bottom w:val="single" w:sz="4" w:color="E0C878"/>
+          <w:right w:val="single" w:sz="4" w:color="E0C878"/>
+        </w:tblBorders>
+        <w:tblCellMar>
+          <w:top w:w="140" w:type="dxa"/>
+          <w:left w:w="200" w:type="dxa"/>
+          <w:bottom w:w="140" w:type="dxa"/>
+          <w:right w:w="200" w:type="dxa"/>
+        </w:tblCellMar>
+      </w:tblPr>
+      <w:tr>
+        <w:tc>
+          <w:tcPr>
+            <w:shd w:val="clear" w:fill="FDE7E9"/>
+          </w:tcPr>
+          <w:p>
+            <w:pPr>
+              <w:spacing w:after="60"/>
+            </w:pPr>
+            <w:r>
+              <w:rPr>
+                <w:b/>
+              </w:rPr>
+              <w:t xml:space="preserve">APP_KEY inilah yang paling sering terlupakan</w:t>
+            </w:r>
+          </w:p>
+          <w:p>
+            <w:pPr>
+              <w:spacing w:after="0"/>
+              <w:jc w:val="both"/>
+            </w:pPr>
+            <w:r>
+              <w:t xml:space="preserve">Banyak orang mencadangkan database dengan rajin, lalu saat memulihkan baru menyadari bahwa nilai-nilai terenkripsi di dalamnya tidak bisa dibaca lagi — karena kuncinya ikut hilang bersama server lama. Perintah </w:t>
+            </w:r>
+            <w:r>
+              <w:rPr>
+                <w:rFonts w:ascii="Consolas" w:hAnsi="Consolas"/>
+                <w:color w:val="B03060"/>
+              </w:rPr>
+              <w:t xml:space="preserve">backup:buat</w:t>
+            </w:r>
+            <w:r>
+              <w:t xml:space="preserve"> menyertakannya secara otomatis, jadi kekeliruan itu tidak mungkin terjadi.</w:t>
+            </w:r>
+          </w:p>
+        </w:tc>
+      </w:tr>
+    </w:tbl>
+    <w:p>
+      <w:pPr>
+        <w:spacing w:after="140"/>
+      </w:pPr>
+    </w:p>
+    <w:p>
+      <w:pPr>
+        <w:pStyle w:val="Heading3"/>
+      </w:pPr>
+      <w:r>
+        <w:t xml:space="preserve">Sebelum dipakai pertama kali</w:t>
+      </w:r>
+    </w:p>
+    <w:p>
+      <w:pPr>
+        <w:spacing w:after="140" w:line="276" w:lineRule="auto"/>
+        <w:jc w:val="both"/>
+      </w:pPr>
+      <w:r>
+        <w:t xml:space="preserve">Isi </w:t>
+      </w:r>
+      <w:r>
+        <w:rPr>
+          <w:rFonts w:ascii="Consolas" w:hAnsi="Consolas"/>
+          <w:color w:val="B03060"/>
+        </w:rPr>
+        <w:t xml:space="preserve">BACKUP_SANDI</w:t>
+      </w:r>
+      <w:r>
+        <w:t xml:space="preserve"> di berkas </w:t>
+      </w:r>
+      <w:r>
+        <w:rPr>
+          <w:rFonts w:ascii="Consolas" w:hAnsi="Consolas"/>
+          <w:color w:val="B03060"/>
+        </w:rPr>
+        <w:t xml:space="preserve">.env</w:t>
+      </w:r>
+      <w:r>
+        <w:t xml:space="preserve">. Perintahnya </w:t>
+      </w:r>
+      <w:r>
+        <w:rPr>
+          <w:b/>
+        </w:rPr>
+        <w:t xml:space="preserve">menolak berjalan</w:t>
+      </w:r>
+      <w:r>
+        <w:t xml:space="preserve"> bila kosong — backup berisi seluruh data siswa beserta APP_KEY, jadi tidak pernah dibuat tanpa enkripsi.</w:t>
+      </w:r>
+    </w:p>
+    <w:tbl>
+      <w:tblPr>
+        <w:tblW w:w="5000" w:type="pct"/>
+        <w:tblBorders>
+          <w:top w:val="single" w:sz="4" w:color="D9D9D9"/>
+          <w:left w:val="single" w:sz="4" w:color="D9D9D9"/>
+          <w:bottom w:val="single" w:sz="4" w:color="D9D9D9"/>
+          <w:right w:val="single" w:sz="4" w:color="D9D9D9"/>
+        </w:tblBorders>
+        <w:tblCellMar>
+          <w:top w:w="120" w:type="dxa"/>
+          <w:left w:w="160" w:type="dxa"/>
+          <w:bottom w:w="120" w:type="dxa"/>
+          <w:right w:w="160" w:type="dxa"/>
+        </w:tblCellMar>
+      </w:tblPr>
+      <w:tr>
+        <w:tc>
+          <w:tcPr>
+            <w:shd w:val="clear" w:fill="F5F5F5"/>
+          </w:tcPr>
+          <w:p>
+            <w:pPr>
+              <w:spacing w:after="0" w:line="240" w:lineRule="auto"/>
+            </w:pPr>
+            <w:r>
+              <w:rPr>
+                <w:rFonts w:ascii="Consolas" w:hAnsi="Consolas"/>
+                <w:sz w:val="18"/>
+              </w:rPr>
+              <w:t xml:space="preserve">BACKUP_SANDI="kalimat rahasia yang panjang dan mudah diingat"</w:t>
+            </w:r>
+          </w:p>
+          <w:p>
+            <w:pPr>
+              <w:spacing w:after="0" w:line="240" w:lineRule="auto"/>
+            </w:pPr>
+            <w:r>
+              <w:rPr>
+                <w:rFonts w:ascii="Consolas" w:hAnsi="Consolas"/>
+                <w:sz w:val="18"/>
+              </w:rPr>
+              <w:t xml:space="preserve">BACKUP_TUJUAN="C:/backup-sim-spenga"</w:t>
+            </w:r>
+          </w:p>
+          <w:p>
+            <w:pPr>
+              <w:spacing w:after="0" w:line="240" w:lineRule="auto"/>
+            </w:pPr>
+            <w:r>
+              <w:rPr>
+                <w:rFonts w:ascii="Consolas" w:hAnsi="Consolas"/>
+                <w:sz w:val="18"/>
+              </w:rPr>
+              <w:t xml:space="preserve">BACKUP_SIMPAN=30</w:t>
+            </w:r>
+          </w:p>
+        </w:tc>
+      </w:tr>
+    </w:tbl>
+    <w:p>
+      <w:pPr>
+        <w:spacing w:after="140"/>
+      </w:pPr>
+    </w:p>
+    <w:tbl>
+      <w:tblPr>
+        <w:tblW w:w="5000" w:type="pct"/>
+        <w:tblBorders>
+          <w:top w:val="single" w:sz="4" w:color="E0C878"/>
+          <w:left w:val="single" w:sz="18" w:color="E0A800"/>
+          <w:bottom w:val="single" w:sz="4" w:color="E0C878"/>
+          <w:right w:val="single" w:sz="4" w:color="E0C878"/>
+        </w:tblBorders>
+        <w:tblCellMar>
+          <w:top w:w="140" w:type="dxa"/>
+          <w:left w:w="200" w:type="dxa"/>
+          <w:bottom w:w="140" w:type="dxa"/>
+          <w:right w:w="200" w:type="dxa"/>
+        </w:tblCellMar>
+      </w:tblPr>
+      <w:tr>
+        <w:tc>
+          <w:tcPr>
+            <w:shd w:val="clear" w:fill="FDE7E9"/>
+          </w:tcPr>
+          <w:p>
+            <w:pPr>
+              <w:spacing w:after="60"/>
+            </w:pPr>
+            <w:r>
+              <w:rPr>
+                <w:b/>
+              </w:rPr>
+              <w:t xml:space="preserve">Simpan kata sandinya DI LUAR komputer server</w:t>
+            </w:r>
+          </w:p>
+          <w:p>
+            <w:pPr>
+              <w:spacing w:after="0"/>
+              <w:jc w:val="both"/>
+            </w:pPr>
+            <w:r>
+              <w:t xml:space="preserve">Di ponsel Kepala Sekolah, di brankas, atau di pengelola kata sandi. Bila kalimat itu hanya ada di komputer yang sama dan komputer itu rusak atau diambil orang, enkripsinya tidak menolong apa pun — sekaligus backup-nya menjadi tidak bisa dibuka oleh Anda sendiri.</w:t>
+            </w:r>
+          </w:p>
+        </w:tc>
+      </w:tr>
+    </w:tbl>
+    <w:p>
+      <w:pPr>
+        <w:spacing w:after="140"/>
+      </w:pPr>
+    </w:p>
+    <w:p>
+      <w:pPr>
+        <w:pStyle w:val="Heading3"/>
+      </w:pPr>
+      <w:r>
+        <w:t xml:space="preserve">Menjadwalkannya</w:t>
+      </w:r>
+    </w:p>
+    <w:p>
+      <w:pPr>
+        <w:spacing w:after="140" w:line="276" w:lineRule="auto"/>
+        <w:jc w:val="both"/>
+      </w:pPr>
+      <w:r>
+        <w:t xml:space="preserve">Di Windows, buka </w:t>
+      </w:r>
+      <w:r>
+        <w:rPr>
+          <w:b/>
+        </w:rPr>
+        <w:t xml:space="preserve">Task Scheduler</w:t>
+      </w:r>
+      <w:r>
+        <w:t xml:space="preserve"> dan jadwalkan perintah berikut setiap hari:</w:t>
+      </w:r>
+    </w:p>
+    <w:tbl>
+      <w:tblPr>
+        <w:tblW w:w="5000" w:type="pct"/>
+        <w:tblBorders>
+          <w:top w:val="single" w:sz="4" w:color="D9D9D9"/>
+          <w:left w:val="single" w:sz="4" w:color="D9D9D9"/>
+          <w:bottom w:val="single" w:sz="4" w:color="D9D9D9"/>
+          <w:right w:val="single" w:sz="4" w:color="D9D9D9"/>
+        </w:tblBorders>
+        <w:tblCellMar>
+          <w:top w:w="120" w:type="dxa"/>
+          <w:left w:w="160" w:type="dxa"/>
+          <w:bottom w:w="120" w:type="dxa"/>
+          <w:right w:w="160" w:type="dxa"/>
+        </w:tblCellMar>
+      </w:tblPr>
+      <w:tr>
+        <w:tc>
+          <w:tcPr>
+            <w:shd w:val="clear" w:fill="F5F5F5"/>
+          </w:tcPr>
+          <w:p>
+            <w:pPr>
+              <w:spacing w:after="0" w:line="240" w:lineRule="auto"/>
+            </w:pPr>
+            <w:r>
+              <w:rPr>
+                <w:rFonts w:ascii="Consolas" w:hAnsi="Consolas"/>
+                <w:sz w:val="18"/>
+              </w:rPr>
+              <w:t xml:space="preserve">cd C:\laragon\www\sim-spenga &amp;&amp; php artisan backup:buat</w:t>
+            </w:r>
+          </w:p>
+        </w:tc>
+      </w:tr>
+    </w:tbl>
+    <w:p>
+      <w:pPr>
+        <w:spacing w:after="140"/>
+      </w:pPr>
+    </w:p>
+    <w:p>
+      <w:pPr>
+        <w:spacing w:after="140" w:line="276" w:lineRule="auto"/>
+        <w:jc w:val="both"/>
+      </w:pPr>
+      <w:r>
+        <w:rPr>
+          <w:rFonts w:ascii="Consolas" w:hAnsi="Consolas"/>
+          <w:color w:val="B03060"/>
+        </w:rPr>
+        <w:t xml:space="preserve">BACKUP_SIMPAN</w:t>
+      </w:r>
+      <w:r>
+        <w:t xml:space="preserve"> menentukan berapa salinan terakhir yang disimpan; yang lebih lama dihapus sendiri. Satu backup hanya beberapa MB, jadi menyimpan 30 hari pun tidak berarti apa-apa bagi kapasitas disk.</w:t>
+      </w:r>
+    </w:p>
+    <w:p>
+      <w:pPr>
+        <w:pStyle w:val="Heading3"/>
+      </w:pPr>
+      <w:r>
+        <w:t xml:space="preserve">Membuka kembali</w:t>
+      </w:r>
+    </w:p>
+    <w:tbl>
+      <w:tblPr>
+        <w:tblW w:w="5000" w:type="pct"/>
+        <w:tblBorders>
+          <w:top w:val="single" w:sz="4" w:color="D9D9D9"/>
+          <w:left w:val="single" w:sz="4" w:color="D9D9D9"/>
+          <w:bottom w:val="single" w:sz="4" w:color="D9D9D9"/>
+          <w:right w:val="single" w:sz="4" w:color="D9D9D9"/>
+        </w:tblBorders>
+        <w:tblCellMar>
+          <w:top w:w="120" w:type="dxa"/>
+          <w:left w:w="160" w:type="dxa"/>
+          <w:bottom w:w="120" w:type="dxa"/>
+          <w:right w:w="160" w:type="dxa"/>
+        </w:tblCellMar>
+      </w:tblPr>
+      <w:tr>
+        <w:tc>
+          <w:tcPr>
+            <w:shd w:val="clear" w:fill="F5F5F5"/>
+          </w:tcPr>
+          <w:p>
+            <w:pPr>
+              <w:spacing w:after="0" w:line="240" w:lineRule="auto"/>
+            </w:pPr>
+            <w:r>
+              <w:rPr>
+                <w:rFonts w:ascii="Consolas" w:hAnsi="Consolas"/>
+                <w:sz w:val="18"/>
+              </w:rPr>
+              <w:t xml:space="preserve">php artisan backup:buka "C:/backup-sim-spenga/sim-spenga-2026-09-03-1705.simbak"</w:t>
+            </w:r>
+          </w:p>
+        </w:tc>
+      </w:tr>
+    </w:tbl>
+    <w:p>
+      <w:pPr>
+        <w:spacing w:after="140"/>
+      </w:pPr>
+    </w:p>
+    <w:p>
+      <w:pPr>
+        <w:spacing w:after="140" w:line="276" w:lineRule="auto"/>
+        <w:jc w:val="both"/>
+      </w:pPr>
+      <w:r>
+        <w:t xml:space="preserve">Hasilnya berkas </w:t>
+      </w:r>
+      <w:r>
+        <w:rPr>
+          <w:rFonts w:ascii="Consolas" w:hAnsi="Consolas"/>
+          <w:color w:val="B03060"/>
+        </w:rPr>
+        <w:t xml:space="preserve">.zip</w:t>
+      </w:r>
+      <w:r>
+        <w:t xml:space="preserve"> biasa berisi </w:t>
+      </w:r>
+      <w:r>
+        <w:rPr>
+          <w:rFonts w:ascii="Consolas" w:hAnsi="Consolas"/>
+          <w:color w:val="B03060"/>
+        </w:rPr>
+        <w:t xml:space="preserve">database.sql</w:t>
+      </w:r>
+      <w:r>
+        <w:t xml:space="preserve">, folder </w:t>
+      </w:r>
+      <w:r>
+        <w:rPr>
+          <w:rFonts w:ascii="Consolas" w:hAnsi="Consolas"/>
+          <w:color w:val="B03060"/>
+        </w:rPr>
+        <w:t xml:space="preserve">storage-app/</w:t>
+      </w:r>
+      <w:r>
+        <w:t xml:space="preserve">, </w:t>
+      </w:r>
+      <w:r>
+        <w:rPr>
+          <w:rFonts w:ascii="Consolas" w:hAnsi="Consolas"/>
+          <w:color w:val="B03060"/>
+        </w:rPr>
+        <w:t xml:space="preserve">RAHASIA.txt</w:t>
+      </w:r>
+      <w:r>
+        <w:t xml:space="preserve"> (APP_KEY), dan </w:t>
+      </w:r>
+      <w:r>
+        <w:rPr>
+          <w:rFonts w:ascii="Consolas" w:hAnsi="Consolas"/>
+          <w:color w:val="B03060"/>
+        </w:rPr>
+        <w:t xml:space="preserve">BACA-SAYA.txt</w:t>
+      </w:r>
+      <w:r>
+        <w:t xml:space="preserve"> yang memuat langkah pemulihannya. Berkas hasil bukaan itu </w:t>
+      </w:r>
+      <w:r>
+        <w:rPr>
+          <w:b/>
+        </w:rPr>
+        <w:t xml:space="preserve">tidak terenkripsi lagi</w:t>
+      </w:r>
+      <w:r>
+        <w:t xml:space="preserve"> — hapus segera setelah selesai dipakai.</w:t>
+      </w:r>
+    </w:p>
+    <w:tbl>
+      <w:tblPr>
+        <w:tblW w:w="5000" w:type="pct"/>
+        <w:tblBorders>
+          <w:top w:val="single" w:sz="4" w:color="E0C878"/>
+          <w:left w:val="single" w:sz="18" w:color="E0A800"/>
+          <w:bottom w:val="single" w:sz="4" w:color="E0C878"/>
+          <w:right w:val="single" w:sz="4" w:color="E0C878"/>
+        </w:tblBorders>
+        <w:tblCellMar>
+          <w:top w:w="140" w:type="dxa"/>
+          <w:left w:w="200" w:type="dxa"/>
+          <w:bottom w:w="140" w:type="dxa"/>
+          <w:right w:w="200" w:type="dxa"/>
+        </w:tblCellMar>
+      </w:tblPr>
+      <w:tr>
+        <w:tc>
+          <w:tcPr>
+            <w:shd w:val="clear" w:fill="FFF4CE"/>
+          </w:tcPr>
+          <w:p>
+            <w:pPr>
+              <w:spacing w:after="60"/>
+            </w:pPr>
+            <w:r>
+              <w:rPr>
+                <w:b/>
+              </w:rPr>
+              <w:t xml:space="preserve">Ujilah sekali, di komputer LAIN</w:t>
+            </w:r>
+          </w:p>
+          <w:p>
+            <w:pPr>
+              <w:spacing w:after="0"/>
+              <w:jc w:val="both"/>
+            </w:pPr>
+            <w:r>
+              <w:t xml:space="preserve">Backup yang belum pernah dicoba dipulihkan bukan backup, melainkan harapan. Dan mengujinya di komputer yang sama tidak membuktikan apa pun tentang keadaan saat komputer itulah yang rusak — justru keadaan itu yang sedang Anda persiapkan.</w:t>
+            </w:r>
+          </w:p>
+        </w:tc>
+      </w:tr>
+    </w:tbl>
+    <w:p>
+      <w:pPr>
+        <w:spacing w:after="140"/>
+      </w:pPr>
+    </w:p>
+    <w:p>
+      <w:pPr>
+        <w:pStyle w:val="Heading2"/>
+      </w:pPr>
+      <w:r>
+        <w:t xml:space="preserve">B.2b Cara alternatif — lewat phpMyAdmin</w:t>
+      </w:r>
+    </w:p>
+    <w:p>
+      <w:pPr>
+        <w:spacing w:after="140" w:line="276" w:lineRule="auto"/>
+        <w:jc w:val="both"/>
+      </w:pPr>
+      <w:r>
+        <w:t xml:space="preserve">Cocok untuk Admin yang tidak terbiasa dengan baris perintah. </w:t>
+      </w:r>
+      <w:r>
+        <w:rPr>
+          <w:b/>
+        </w:rPr>
+        <w:t xml:space="preserve">Ingat:</w:t>
+      </w:r>
+      <w:r>
+        <w:t xml:space="preserve"> cara ini hanya mencadangkan databasenya saja — folder unggahan dan APP_KEY harus Anda salin sendiri (lihat B.4).</w:t>
       </w:r>
     </w:p>
     <w:p>

</xml_diff>

<commit_message>
feat: implement semester archive progress tracking and cleanup command
- Updated queue worker command to include multiple queues for processing.
- Added a new command to clean up old archive files older than one year.
- Introduced progress tracking for semester archive creation, allowing admins to see real-time status updates.
- Created a new class for printing HTML to PDF using Chrome, ensuring accurate rendering.
- Added configuration for specifying the location of Chrome/Chromium.
- Updated database schema to include progress and current step for archive creation.
- Enhanced various views to include a letterhead component for printed documents.
- Implemented JavaScript functionality to periodically check the status of archive creation.
</commit_message>
<xml_diff>
--- a/docs/Panduan-Database-Admin.docx
+++ b/docs/Panduan-Database-Admin.docx
@@ -9097,7 +9097,7 @@
                 <w:color w:val="B03060"/>
                 <w:sz w:val="19"/>
               </w:rPr>
-              <w:t xml:space="preserve">php artisan queue:work</w:t>
+              <w:t xml:space="preserve">php artisan queue:work --queue=arsip,notifikasi,pengingat-guru,default</w:t>
             </w:r>
           </w:p>
         </w:tc>
@@ -9127,7 +9127,21 @@
               <w:rPr>
                 <w:sz w:val="19"/>
               </w:rPr>
-              <w:t xml:space="preserve">. Inilah yang benar-benar menghubungi layanan WhatsApp dan mengirim pesannya.</w:t>
+              <w:t xml:space="preserve">. Inilah yang benar-benar mengirim pesan WhatsApp dan membuat arsip semester. Daftar antrian WAJIB disebutkan — tanpa itu hanya antrian </w:t>
+            </w:r>
+            <w:r>
+              <w:rPr>
+                <w:rFonts w:ascii="Consolas" w:hAnsi="Consolas"/>
+                <w:color w:val="B03060"/>
+                <w:sz w:val="19"/>
+              </w:rPr>
+              <w:t xml:space="preserve">default</w:t>
+            </w:r>
+            <w:r>
+              <w:rPr>
+                <w:sz w:val="19"/>
+              </w:rPr>
+              <w:t xml:space="preserve"> yang dilayani, dan pekerjaan lain menunggu selamanya.</w:t>
             </w:r>
           </w:p>
         </w:tc>
@@ -9146,6 +9160,72 @@
       <w:r>
         <w:t xml:space="preserve">Pembagian ini disengaja: menghubungi layanan luar bisa memakan beberapa detik, dan pekerjaan itu tidak boleh membuat guru menunggu saat menekan tombol Simpan.</w:t>
       </w:r>
+    </w:p>
+    <w:tbl>
+      <w:tblPr>
+        <w:tblW w:w="5000" w:type="pct"/>
+        <w:tblBorders>
+          <w:top w:val="single" w:sz="4" w:color="E0C878"/>
+          <w:left w:val="single" w:sz="18" w:color="E0A800"/>
+          <w:bottom w:val="single" w:sz="4" w:color="E0C878"/>
+          <w:right w:val="single" w:sz="4" w:color="E0C878"/>
+        </w:tblBorders>
+        <w:tblCellMar>
+          <w:top w:w="140" w:type="dxa"/>
+          <w:left w:w="200" w:type="dxa"/>
+          <w:bottom w:w="140" w:type="dxa"/>
+          <w:right w:w="200" w:type="dxa"/>
+        </w:tblCellMar>
+      </w:tblPr>
+      <w:tr>
+        <w:tc>
+          <w:tcPr>
+            <w:shd w:val="clear" w:fill="FFF4CE"/>
+          </w:tcPr>
+          <w:p>
+            <w:pPr>
+              <w:spacing w:after="60"/>
+            </w:pPr>
+            <w:r>
+              <w:rPr>
+                <w:b/>
+              </w:rPr>
+              <w:t xml:space="preserve">Setiap kali aplikasi diperbarui, jalankan </w:t>
+            </w:r>
+            <w:r>
+              <w:rPr>
+                <w:b/>
+                <w:rFonts w:ascii="Consolas" w:hAnsi="Consolas"/>
+                <w:color w:val="B03060"/>
+              </w:rPr>
+              <w:t xml:space="preserve">php artisan queue:restart</w:t>
+            </w:r>
+          </w:p>
+          <w:p>
+            <w:pPr>
+              <w:spacing w:after="0"/>
+              <w:jc w:val="both"/>
+            </w:pPr>
+            <w:r>
+              <w:t xml:space="preserve">Pekerja antrian adalah proses yang hidup terus. Ia memuat kode </w:t>
+            </w:r>
+            <w:r>
+              <w:rPr>
+                <w:b/>
+              </w:rPr>
+              <w:t xml:space="preserve">sekali</w:t>
+            </w:r>
+            <w:r>
+              <w:t xml:space="preserve"> saat dijalankan, lalu memakai salinan itu untuk semua pekerjaan berikutnya — pembaruan tidak pernah sampai kepadanya sampai ia dimuat ulang. Gejalanya menyesatkan karena tidak ada galat sama sekali: pekerjaannya tetap selesai, hanya dikerjakan oleh versi lama. Perintah di atas menyuruhnya berhenti dengan rapi setelah pekerjaan yang sedang berjalan selesai; Task Scheduler akan menyalakannya kembali.</w:t>
+            </w:r>
+          </w:p>
+        </w:tc>
+      </w:tr>
+    </w:tbl>
+    <w:p>
+      <w:pPr>
+        <w:spacing w:after="140"/>
+      </w:pPr>
     </w:p>
     <w:p>
       <w:pPr>
@@ -9771,7 +9851,7 @@
                 <w:rFonts w:ascii="Consolas" w:hAnsi="Consolas"/>
                 <w:sz w:val="18"/>
               </w:rPr>
-              <w:t xml:space="preserve">C:\laragon\bin\php\php-8.3.30-Win32-vs16-x64\php.exe artisan queue:work --queue=notifikasi,pengingat-guru,default --tries=3 --sleep=3</w:t>
+              <w:t xml:space="preserve">C:\laragon\bin\php\php-8.3.30-Win32-vs16-x64\php.exe artisan queue:work --queue=arsip,notifikasi,pengingat-guru,default --tries=3 --sleep=3</w:t>
             </w:r>
           </w:p>
         </w:tc>

</xml_diff>